<commit_message>
docs(tesis): documentación Scrum del Proyecto APT al 29-10-2026
- Cierre del Sprint 3 (16-10): Release v1.3.0, Review y Retro; Backlog,
  Scrumboard, Burndown e Impedimentos en v1.2. HU-12 no aceptada.
- Sprint 4 (S11-S12) hasta el día 9: Planning, Backlog, Scrumboard,
  Burndown e Impedimentos (IMP-16 e IMP-17).
- Daily Meeting #01 a #58 (archivo renombrado a "S1 a S12").
- Product Backlog v1.6 y planilla de seguimiento al 29-10.
- Presentación de avance (29-10-2026).

Co-Authored-By: Claude Opus 5.5 <noreply@anthropic.com>
</commit_message>
<xml_diff>
--- a/tesis/1. Definición del proyecto (S1-S4)/09 - Product Backlog Priorizado.docx
+++ b/tesis/1. Definición del proyecto (S1-S4)/09 - Product Backlog Priorizado.docx
@@ -147,7 +147,7 @@
           </w:tcPr>
           <w:p>
             <w:r>
-              <w:t xml:space="preserve">05-10-2026</w:t>
+              <w:t xml:space="preserve">19-10-2026</w:t>
             </w:r>
           </w:p>
         </w:tc>
@@ -173,7 +173,7 @@
           </w:tcPr>
           <w:p>
             <w:r>
-              <w:t xml:space="preserve">1.4</w:t>
+              <w:t xml:space="preserve">1.6</w:t>
             </w:r>
           </w:p>
         </w:tc>
@@ -2703,7 +2703,7 @@
               <w:rPr>
                 <w:sz w:val="15"/>
               </w:rPr>
-              <w:t xml:space="preserve">Comprometida (Sprint 3)</w:t>
+              <w:t xml:space="preserve">Hecho</w:t>
             </w:r>
           </w:p>
         </w:tc>
@@ -2831,7 +2831,7 @@
               <w:rPr>
                 <w:sz w:val="15"/>
               </w:rPr>
-              <w:t xml:space="preserve">Comprometida (Sprint 3)</w:t>
+              <w:t xml:space="preserve">Hecho</w:t>
             </w:r>
           </w:p>
         </w:tc>
@@ -2861,21 +2861,21 @@
               <w:rPr>
                 <w:sz w:val="15"/>
               </w:rPr>
-              <w:t xml:space="preserve">HU-12</w:t>
-            </w:r>
-          </w:p>
-        </w:tc>
-        <w:tc>
-          <w:tcPr>
-            <w:tcW w:type="dxa" w:w="737"/>
-          </w:tcPr>
-          <w:p>
-            <w:r/>
-            <w:r>
-              <w:rPr>
-                <w:sz w:val="15"/>
-              </w:rPr>
-              <w:t xml:space="preserve">EP-05</w:t>
+              <w:t xml:space="preserve">HU-21</w:t>
+            </w:r>
+          </w:p>
+        </w:tc>
+        <w:tc>
+          <w:tcPr>
+            <w:tcW w:type="dxa" w:w="737"/>
+          </w:tcPr>
+          <w:p>
+            <w:r/>
+            <w:r>
+              <w:rPr>
+                <w:sz w:val="15"/>
+              </w:rPr>
+              <w:t xml:space="preserve">EP-07</w:t>
             </w:r>
           </w:p>
         </w:tc>
@@ -2889,7 +2889,7 @@
               <w:rPr>
                 <w:sz w:val="15"/>
               </w:rPr>
-              <w:t xml:space="preserve">Secretaria quiero que el registro de integrantes por QR exija aceptar el tratamiento de datos</w:t>
+              <w:t xml:space="preserve">plataforma quiero probar la seguridad en staging (inyección SQL, CSRF, suplantación de origen, reuso de refresh token) y corregir los hallazgos</w:t>
             </w:r>
           </w:p>
         </w:tc>
@@ -2903,7 +2903,7 @@
               <w:rPr>
                 <w:sz w:val="15"/>
               </w:rPr>
-              <w:t xml:space="preserve">5</w:t>
+              <w:t xml:space="preserve">8</w:t>
             </w:r>
           </w:p>
         </w:tc>
@@ -2945,7 +2945,7 @@
               <w:rPr>
                 <w:sz w:val="15"/>
               </w:rPr>
-              <w:t xml:space="preserve">Sprint 3</w:t>
+              <w:t xml:space="preserve">Sprint 4</w:t>
             </w:r>
           </w:p>
         </w:tc>
@@ -2959,7 +2959,7 @@
               <w:rPr>
                 <w:sz w:val="15"/>
               </w:rPr>
-              <w:t xml:space="preserve">Comprometida (Sprint 3)</w:t>
+              <w:t xml:space="preserve">Comprometida (Sprint 4)</w:t>
             </w:r>
           </w:p>
         </w:tc>
@@ -2989,21 +2989,21 @@
               <w:rPr>
                 <w:sz w:val="15"/>
               </w:rPr>
-              <w:t xml:space="preserve">HU-21</w:t>
-            </w:r>
-          </w:p>
-        </w:tc>
-        <w:tc>
-          <w:tcPr>
-            <w:tcW w:type="dxa" w:w="737"/>
-          </w:tcPr>
-          <w:p>
-            <w:r/>
-            <w:r>
-              <w:rPr>
-                <w:sz w:val="15"/>
-              </w:rPr>
-              <w:t xml:space="preserve">EP-07</w:t>
+              <w:t xml:space="preserve">HU-29</w:t>
+            </w:r>
+          </w:p>
+        </w:tc>
+        <w:tc>
+          <w:tcPr>
+            <w:tcW w:type="dxa" w:w="737"/>
+          </w:tcPr>
+          <w:p>
+            <w:r/>
+            <w:r>
+              <w:rPr>
+                <w:sz w:val="15"/>
+              </w:rPr>
+              <w:t xml:space="preserve">EP-08</w:t>
             </w:r>
           </w:p>
         </w:tc>
@@ -3017,7 +3017,7 @@
               <w:rPr>
                 <w:sz w:val="15"/>
               </w:rPr>
-              <w:t xml:space="preserve">plataforma quiero probar la seguridad en staging (inyección SQL, CSRF, suplantación de origen, reuso de refresh token) y corregir los hallazgos</w:t>
+              <w:t xml:space="preserve">plataforma quiero pruebas de carga con k6 sobre los endpoints principales</w:t>
             </w:r>
           </w:p>
         </w:tc>
@@ -3031,7 +3031,7 @@
               <w:rPr>
                 <w:sz w:val="15"/>
               </w:rPr>
-              <w:t xml:space="preserve">8</w:t>
+              <w:t xml:space="preserve">5</w:t>
             </w:r>
           </w:p>
         </w:tc>
@@ -3045,7 +3045,7 @@
               <w:rPr>
                 <w:sz w:val="15"/>
               </w:rPr>
-              <w:t xml:space="preserve">Must</w:t>
+              <w:t xml:space="preserve">Should</w:t>
             </w:r>
           </w:p>
         </w:tc>
@@ -3059,7 +3059,7 @@
               <w:rPr>
                 <w:sz w:val="15"/>
               </w:rPr>
-              <w:t xml:space="preserve">8</w:t>
+              <w:t xml:space="preserve">7</w:t>
             </w:r>
           </w:p>
         </w:tc>
@@ -3087,7 +3087,7 @@
               <w:rPr>
                 <w:sz w:val="15"/>
               </w:rPr>
-              <w:t xml:space="preserve">Pendiente</w:t>
+              <w:t xml:space="preserve">Comprometida (Sprint 4)</w:t>
             </w:r>
           </w:p>
         </w:tc>
@@ -3117,7 +3117,7 @@
               <w:rPr>
                 <w:sz w:val="15"/>
               </w:rPr>
-              <w:t xml:space="preserve">HU-29</w:t>
+              <w:t xml:space="preserve">HU-32</w:t>
             </w:r>
           </w:p>
         </w:tc>
@@ -3145,7 +3145,7 @@
               <w:rPr>
                 <w:sz w:val="15"/>
               </w:rPr>
-              <w:t xml:space="preserve">plataforma quiero pruebas de carga con k6 sobre los endpoints principales</w:t>
+              <w:t xml:space="preserve">equipo quiero una ronda de QA funcional en staging (ceremonias, integrantes/QR, predicadores, límites de plan)</w:t>
             </w:r>
           </w:p>
         </w:tc>
@@ -3215,7 +3215,7 @@
               <w:rPr>
                 <w:sz w:val="15"/>
               </w:rPr>
-              <w:t xml:space="preserve">Pendiente</w:t>
+              <w:t xml:space="preserve">Comprometida (Sprint 4)</w:t>
             </w:r>
           </w:p>
         </w:tc>
@@ -3245,21 +3245,21 @@
               <w:rPr>
                 <w:sz w:val="15"/>
               </w:rPr>
-              <w:t xml:space="preserve">HU-32</w:t>
-            </w:r>
-          </w:p>
-        </w:tc>
-        <w:tc>
-          <w:tcPr>
-            <w:tcW w:type="dxa" w:w="737"/>
-          </w:tcPr>
-          <w:p>
-            <w:r/>
-            <w:r>
-              <w:rPr>
-                <w:sz w:val="15"/>
-              </w:rPr>
-              <w:t xml:space="preserve">EP-08</w:t>
+              <w:t xml:space="preserve">HU-24</w:t>
+            </w:r>
+          </w:p>
+        </w:tc>
+        <w:tc>
+          <w:tcPr>
+            <w:tcW w:type="dxa" w:w="737"/>
+          </w:tcPr>
+          <w:p>
+            <w:r/>
+            <w:r>
+              <w:rPr>
+                <w:sz w:val="15"/>
+              </w:rPr>
+              <w:t xml:space="preserve">EP-09</w:t>
             </w:r>
           </w:p>
         </w:tc>
@@ -3273,7 +3273,7 @@
               <w:rPr>
                 <w:sz w:val="15"/>
               </w:rPr>
-              <w:t xml:space="preserve">equipo quiero una ronda de QA funcional en staging (ceremonias, integrantes/QR, predicadores, límites de plan)</w:t>
+              <w:t xml:space="preserve">desarrollador quiero migrar el tiempo real de socket.io a Supabase Realtime (Broadcast)</w:t>
             </w:r>
           </w:p>
         </w:tc>
@@ -3315,7 +3315,7 @@
               <w:rPr>
                 <w:sz w:val="15"/>
               </w:rPr>
-              <w:t xml:space="preserve">7</w:t>
+              <w:t xml:space="preserve">6</w:t>
             </w:r>
           </w:p>
         </w:tc>
@@ -3343,7 +3343,7 @@
               <w:rPr>
                 <w:sz w:val="15"/>
               </w:rPr>
-              <w:t xml:space="preserve">Pendiente</w:t>
+              <w:t xml:space="preserve">Comprometida (Sprint 4)</w:t>
             </w:r>
           </w:p>
         </w:tc>
@@ -3373,21 +3373,21 @@
               <w:rPr>
                 <w:sz w:val="15"/>
               </w:rPr>
-              <w:t xml:space="preserve">HU-24</w:t>
-            </w:r>
-          </w:p>
-        </w:tc>
-        <w:tc>
-          <w:tcPr>
-            <w:tcW w:type="dxa" w:w="737"/>
-          </w:tcPr>
-          <w:p>
-            <w:r/>
-            <w:r>
-              <w:rPr>
-                <w:sz w:val="15"/>
-              </w:rPr>
-              <w:t xml:space="preserve">EP-09</w:t>
+              <w:t xml:space="preserve">HU-19</w:t>
+            </w:r>
+          </w:p>
+        </w:tc>
+        <w:tc>
+          <w:tcPr>
+            <w:tcW w:type="dxa" w:w="737"/>
+          </w:tcPr>
+          <w:p>
+            <w:r/>
+            <w:r>
+              <w:rPr>
+                <w:sz w:val="15"/>
+              </w:rPr>
+              <w:t xml:space="preserve">EP-07</w:t>
             </w:r>
           </w:p>
         </w:tc>
@@ -3401,7 +3401,7 @@
               <w:rPr>
                 <w:sz w:val="15"/>
               </w:rPr>
-              <w:t xml:space="preserve">desarrollador quiero migrar el tiempo real de socket.io a Supabase Realtime (Broadcast)</w:t>
+              <w:t xml:space="preserve">usuario quiero recuperar mi contraseña por correo</w:t>
             </w:r>
           </w:p>
         </w:tc>
@@ -3429,7 +3429,7 @@
               <w:rPr>
                 <w:sz w:val="15"/>
               </w:rPr>
-              <w:t xml:space="preserve">Should</w:t>
+              <w:t xml:space="preserve">Must</w:t>
             </w:r>
           </w:p>
         </w:tc>
@@ -3443,7 +3443,7 @@
               <w:rPr>
                 <w:sz w:val="15"/>
               </w:rPr>
-              <w:t xml:space="preserve">6</w:t>
+              <w:t xml:space="preserve">8</w:t>
             </w:r>
           </w:p>
         </w:tc>
@@ -3457,7 +3457,7 @@
               <w:rPr>
                 <w:sz w:val="15"/>
               </w:rPr>
-              <w:t xml:space="preserve">Sprint 4</w:t>
+              <w:t xml:space="preserve">Sprint 5</w:t>
             </w:r>
           </w:p>
         </w:tc>
@@ -3501,7 +3501,7 @@
               <w:rPr>
                 <w:sz w:val="15"/>
               </w:rPr>
-              <w:t xml:space="preserve">HU-19</w:t>
+              <w:t xml:space="preserve">HU-20</w:t>
             </w:r>
           </w:p>
         </w:tc>
@@ -3529,7 +3529,7 @@
               <w:rPr>
                 <w:sz w:val="15"/>
               </w:rPr>
-              <w:t xml:space="preserve">usuario quiero recuperar mi contraseña por correo</w:t>
+              <w:t xml:space="preserve">plataforma quiero limitar los intentos de login por cuenta</w:t>
             </w:r>
           </w:p>
         </w:tc>
@@ -3543,7 +3543,7 @@
               <w:rPr>
                 <w:sz w:val="15"/>
               </w:rPr>
-              <w:t xml:space="preserve">5</w:t>
+              <w:t xml:space="preserve">2</w:t>
             </w:r>
           </w:p>
         </w:tc>
@@ -3629,21 +3629,21 @@
               <w:rPr>
                 <w:sz w:val="15"/>
               </w:rPr>
-              <w:t xml:space="preserve">HU-20</w:t>
-            </w:r>
-          </w:p>
-        </w:tc>
-        <w:tc>
-          <w:tcPr>
-            <w:tcW w:type="dxa" w:w="737"/>
-          </w:tcPr>
-          <w:p>
-            <w:r/>
-            <w:r>
-              <w:rPr>
-                <w:sz w:val="15"/>
-              </w:rPr>
-              <w:t xml:space="preserve">EP-07</w:t>
+              <w:t xml:space="preserve">HU-22</w:t>
+            </w:r>
+          </w:p>
+        </w:tc>
+        <w:tc>
+          <w:tcPr>
+            <w:tcW w:type="dxa" w:w="737"/>
+          </w:tcPr>
+          <w:p>
+            <w:r/>
+            <w:r>
+              <w:rPr>
+                <w:sz w:val="15"/>
+              </w:rPr>
+              <w:t xml:space="preserve">EP-08</w:t>
             </w:r>
           </w:p>
         </w:tc>
@@ -3657,7 +3657,7 @@
               <w:rPr>
                 <w:sz w:val="15"/>
               </w:rPr>
-              <w:t xml:space="preserve">plataforma quiero limitar los intentos de login por cuenta</w:t>
+              <w:t xml:space="preserve">desarrollador quiero levantar la base de datos local con docker-compose</w:t>
             </w:r>
           </w:p>
         </w:tc>
@@ -3671,7 +3671,7 @@
               <w:rPr>
                 <w:sz w:val="15"/>
               </w:rPr>
-              <w:t xml:space="preserve">2</w:t>
+              <w:t xml:space="preserve">3</w:t>
             </w:r>
           </w:p>
         </w:tc>
@@ -3757,7 +3757,7 @@
               <w:rPr>
                 <w:sz w:val="15"/>
               </w:rPr>
-              <w:t xml:space="preserve">HU-22</w:t>
+              <w:t xml:space="preserve">HU-25</w:t>
             </w:r>
           </w:p>
         </w:tc>
@@ -3785,7 +3785,7 @@
               <w:rPr>
                 <w:sz w:val="15"/>
               </w:rPr>
-              <w:t xml:space="preserve">desarrollador quiero levantar la base de datos local con docker-compose</w:t>
+              <w:t xml:space="preserve">equipo quiero consolidar el ambiente de producción (ramas, base de datos y dominio propio)</w:t>
             </w:r>
           </w:p>
         </w:tc>
@@ -3885,21 +3885,21 @@
               <w:rPr>
                 <w:sz w:val="15"/>
               </w:rPr>
-              <w:t xml:space="preserve">HU-25</w:t>
-            </w:r>
-          </w:p>
-        </w:tc>
-        <w:tc>
-          <w:tcPr>
-            <w:tcW w:type="dxa" w:w="737"/>
-          </w:tcPr>
-          <w:p>
-            <w:r/>
-            <w:r>
-              <w:rPr>
-                <w:sz w:val="15"/>
-              </w:rPr>
-              <w:t xml:space="preserve">EP-08</w:t>
+              <w:t xml:space="preserve">HU-06</w:t>
+            </w:r>
+          </w:p>
+        </w:tc>
+        <w:tc>
+          <w:tcPr>
+            <w:tcW w:type="dxa" w:w="737"/>
+          </w:tcPr>
+          <w:p>
+            <w:r/>
+            <w:r>
+              <w:rPr>
+                <w:sz w:val="15"/>
+              </w:rPr>
+              <w:t xml:space="preserve">EP-02</w:t>
             </w:r>
           </w:p>
         </w:tc>
@@ -3913,7 +3913,7 @@
               <w:rPr>
                 <w:sz w:val="15"/>
               </w:rPr>
-              <w:t xml:space="preserve">equipo quiero consolidar el ambiente de producción (ramas, base de datos y dominio propio)</w:t>
+              <w:t xml:space="preserve">Pastor quiero ver el estado de la convocatoria (confirmó / no asistirá / sin respuesta)</w:t>
             </w:r>
           </w:p>
         </w:tc>
@@ -3927,7 +3927,7 @@
               <w:rPr>
                 <w:sz w:val="15"/>
               </w:rPr>
-              <w:t xml:space="preserve">3</w:t>
+              <w:t xml:space="preserve">5</w:t>
             </w:r>
           </w:p>
         </w:tc>
@@ -3941,7 +3941,7 @@
               <w:rPr>
                 <w:sz w:val="15"/>
               </w:rPr>
-              <w:t xml:space="preserve">Must</w:t>
+              <w:t xml:space="preserve">Should</w:t>
             </w:r>
           </w:p>
         </w:tc>
@@ -3955,7 +3955,7 @@
               <w:rPr>
                 <w:sz w:val="15"/>
               </w:rPr>
-              <w:t xml:space="preserve">8</w:t>
+              <w:t xml:space="preserve">7</w:t>
             </w:r>
           </w:p>
         </w:tc>
@@ -4013,21 +4013,21 @@
               <w:rPr>
                 <w:sz w:val="15"/>
               </w:rPr>
-              <w:t xml:space="preserve">HU-06</w:t>
-            </w:r>
-          </w:p>
-        </w:tc>
-        <w:tc>
-          <w:tcPr>
-            <w:tcW w:type="dxa" w:w="737"/>
-          </w:tcPr>
-          <w:p>
-            <w:r/>
-            <w:r>
-              <w:rPr>
-                <w:sz w:val="15"/>
-              </w:rPr>
-              <w:t xml:space="preserve">EP-02</w:t>
+              <w:t xml:space="preserve">HU-07</w:t>
+            </w:r>
+          </w:p>
+        </w:tc>
+        <w:tc>
+          <w:tcPr>
+            <w:tcW w:type="dxa" w:w="737"/>
+          </w:tcPr>
+          <w:p>
+            <w:r/>
+            <w:r>
+              <w:rPr>
+                <w:sz w:val="15"/>
+              </w:rPr>
+              <w:t xml:space="preserve">EP-09</w:t>
             </w:r>
           </w:p>
         </w:tc>
@@ -4041,7 +4041,7 @@
               <w:rPr>
                 <w:sz w:val="15"/>
               </w:rPr>
-              <w:t xml:space="preserve">Pastor quiero ver el estado de la convocatoria (confirmó / no asistirá / sin respuesta)</w:t>
+              <w:t xml:space="preserve">Pastor quiero ver la asistencia al evento en vivo mientras los integrantes confirman</w:t>
             </w:r>
           </w:p>
         </w:tc>
@@ -4055,7 +4055,7 @@
               <w:rPr>
                 <w:sz w:val="15"/>
               </w:rPr>
-              <w:t xml:space="preserve">5</w:t>
+              <w:t xml:space="preserve">3</w:t>
             </w:r>
           </w:p>
         </w:tc>
@@ -4069,7 +4069,7 @@
               <w:rPr>
                 <w:sz w:val="15"/>
               </w:rPr>
-              <w:t xml:space="preserve">Should</w:t>
+              <w:t xml:space="preserve">Could</w:t>
             </w:r>
           </w:p>
         </w:tc>
@@ -4083,7 +4083,7 @@
               <w:rPr>
                 <w:sz w:val="15"/>
               </w:rPr>
-              <w:t xml:space="preserve">7</w:t>
+              <w:t xml:space="preserve">6</w:t>
             </w:r>
           </w:p>
         </w:tc>
@@ -4141,21 +4141,21 @@
               <w:rPr>
                 <w:sz w:val="15"/>
               </w:rPr>
-              <w:t xml:space="preserve">HU-07</w:t>
-            </w:r>
-          </w:p>
-        </w:tc>
-        <w:tc>
-          <w:tcPr>
-            <w:tcW w:type="dxa" w:w="737"/>
-          </w:tcPr>
-          <w:p>
-            <w:r/>
-            <w:r>
-              <w:rPr>
-                <w:sz w:val="15"/>
-              </w:rPr>
-              <w:t xml:space="preserve">EP-09</w:t>
+              <w:t xml:space="preserve">HU-28</w:t>
+            </w:r>
+          </w:p>
+        </w:tc>
+        <w:tc>
+          <w:tcPr>
+            <w:tcW w:type="dxa" w:w="737"/>
+          </w:tcPr>
+          <w:p>
+            <w:r/>
+            <w:r>
+              <w:rPr>
+                <w:sz w:val="15"/>
+              </w:rPr>
+              <w:t xml:space="preserve">EP-02</w:t>
             </w:r>
           </w:p>
         </w:tc>
@@ -4169,7 +4169,7 @@
               <w:rPr>
                 <w:sz w:val="15"/>
               </w:rPr>
-              <w:t xml:space="preserve">Pastor quiero ver la asistencia al evento en vivo mientras los integrantes confirman</w:t>
+              <w:t xml:space="preserve">predicador invitado quiero recibir un correo propio, distinto de la convocatoria masiva</w:t>
             </w:r>
           </w:p>
         </w:tc>
@@ -4183,7 +4183,7 @@
               <w:rPr>
                 <w:sz w:val="15"/>
               </w:rPr>
-              <w:t xml:space="preserve">3</w:t>
+              <w:t xml:space="preserve">2</w:t>
             </w:r>
           </w:p>
         </w:tc>
@@ -4211,7 +4211,7 @@
               <w:rPr>
                 <w:sz w:val="15"/>
               </w:rPr>
-              <w:t xml:space="preserve">6</w:t>
+              <w:t xml:space="preserve">5</w:t>
             </w:r>
           </w:p>
         </w:tc>
@@ -4269,7 +4269,7 @@
               <w:rPr>
                 <w:sz w:val="15"/>
               </w:rPr>
-              <w:t xml:space="preserve">HU-28</w:t>
+              <w:t xml:space="preserve">HU-05</w:t>
             </w:r>
           </w:p>
         </w:tc>
@@ -4297,7 +4297,7 @@
               <w:rPr>
                 <w:sz w:val="15"/>
               </w:rPr>
-              <w:t xml:space="preserve">predicador invitado quiero recibir un correo propio, distinto de la convocatoria masiva</w:t>
+              <w:t xml:space="preserve">Pastor quiero convocar a los integrantes a un evento por WhatsApp además del correo</w:t>
             </w:r>
           </w:p>
         </w:tc>
@@ -4311,7 +4311,7 @@
               <w:rPr>
                 <w:sz w:val="15"/>
               </w:rPr>
-              <w:t xml:space="preserve">2</w:t>
+              <w:t xml:space="preserve">8</w:t>
             </w:r>
           </w:p>
         </w:tc>
@@ -4325,7 +4325,7 @@
               <w:rPr>
                 <w:sz w:val="15"/>
               </w:rPr>
-              <w:t xml:space="preserve">Could</w:t>
+              <w:t xml:space="preserve">Should</w:t>
             </w:r>
           </w:p>
         </w:tc>
@@ -4339,7 +4339,7 @@
               <w:rPr>
                 <w:sz w:val="15"/>
               </w:rPr>
-              <w:t xml:space="preserve">5</w:t>
+              <w:t xml:space="preserve">7</w:t>
             </w:r>
           </w:p>
         </w:tc>
@@ -4353,7 +4353,7 @@
               <w:rPr>
                 <w:sz w:val="15"/>
               </w:rPr>
-              <w:t xml:space="preserve">Sprint 5</w:t>
+              <w:t xml:space="preserve">Sin asignar (era Sprint 2)</w:t>
             </w:r>
           </w:p>
         </w:tc>
@@ -4367,7 +4367,7 @@
               <w:rPr>
                 <w:sz w:val="15"/>
               </w:rPr>
-              <w:t xml:space="preserve">Pendiente</w:t>
+              <w:t xml:space="preserve">Pendiente: no aceptada en el Sprint 2 (IMP-09)</w:t>
             </w:r>
           </w:p>
         </w:tc>
@@ -4397,21 +4397,21 @@
               <w:rPr>
                 <w:sz w:val="15"/>
               </w:rPr>
-              <w:t xml:space="preserve">HU-05</w:t>
-            </w:r>
-          </w:p>
-        </w:tc>
-        <w:tc>
-          <w:tcPr>
-            <w:tcW w:type="dxa" w:w="737"/>
-          </w:tcPr>
-          <w:p>
-            <w:r/>
-            <w:r>
-              <w:rPr>
-                <w:sz w:val="15"/>
-              </w:rPr>
-              <w:t xml:space="preserve">EP-02</w:t>
+              <w:t xml:space="preserve">HU-12</w:t>
+            </w:r>
+          </w:p>
+        </w:tc>
+        <w:tc>
+          <w:tcPr>
+            <w:tcW w:type="dxa" w:w="737"/>
+          </w:tcPr>
+          <w:p>
+            <w:r/>
+            <w:r>
+              <w:rPr>
+                <w:sz w:val="15"/>
+              </w:rPr>
+              <w:t xml:space="preserve">EP-05</w:t>
             </w:r>
           </w:p>
         </w:tc>
@@ -4425,7 +4425,7 @@
               <w:rPr>
                 <w:sz w:val="15"/>
               </w:rPr>
-              <w:t xml:space="preserve">Pastor quiero convocar a los integrantes a un evento por WhatsApp además del correo</w:t>
+              <w:t xml:space="preserve">Secretaria quiero que el registro de integrantes por QR exija aceptar el tratamiento de datos</w:t>
             </w:r>
           </w:p>
         </w:tc>
@@ -4439,40 +4439,40 @@
               <w:rPr>
                 <w:sz w:val="15"/>
               </w:rPr>
+              <w:t xml:space="preserve">5</w:t>
+            </w:r>
+          </w:p>
+        </w:tc>
+        <w:tc>
+          <w:tcPr>
+            <w:tcW w:type="dxa" w:w="794"/>
+          </w:tcPr>
+          <w:p>
+            <w:r/>
+            <w:r>
+              <w:rPr>
+                <w:sz w:val="15"/>
+              </w:rPr>
+              <w:t xml:space="preserve">Must</w:t>
+            </w:r>
+          </w:p>
+        </w:tc>
+        <w:tc>
+          <w:tcPr>
+            <w:tcW w:type="dxa" w:w="624"/>
+          </w:tcPr>
+          <w:p>
+            <w:r/>
+            <w:r>
+              <w:rPr>
+                <w:sz w:val="15"/>
+              </w:rPr>
               <w:t xml:space="preserve">8</w:t>
             </w:r>
           </w:p>
         </w:tc>
         <w:tc>
           <w:tcPr>
-            <w:tcW w:type="dxa" w:w="794"/>
-          </w:tcPr>
-          <w:p>
-            <w:r/>
-            <w:r>
-              <w:rPr>
-                <w:sz w:val="15"/>
-              </w:rPr>
-              <w:t xml:space="preserve">Should</w:t>
-            </w:r>
-          </w:p>
-        </w:tc>
-        <w:tc>
-          <w:tcPr>
-            <w:tcW w:type="dxa" w:w="624"/>
-          </w:tcPr>
-          <w:p>
-            <w:r/>
-            <w:r>
-              <w:rPr>
-                <w:sz w:val="15"/>
-              </w:rPr>
-              <w:t xml:space="preserve">7</w:t>
-            </w:r>
-          </w:p>
-        </w:tc>
-        <w:tc>
-          <w:tcPr>
             <w:tcW w:type="dxa" w:w="1247"/>
           </w:tcPr>
           <w:p>
@@ -4481,7 +4481,7 @@
               <w:rPr>
                 <w:sz w:val="15"/>
               </w:rPr>
-              <w:t xml:space="preserve">Sin asignar (era Sprint 2)</w:t>
+              <w:t xml:space="preserve">Sin asignar (era Sprint 3)</w:t>
             </w:r>
           </w:p>
         </w:tc>
@@ -4495,7 +4495,7 @@
               <w:rPr>
                 <w:sz w:val="15"/>
               </w:rPr>
-              <w:t xml:space="preserve">Pendiente: no aceptada en el Sprint 2 (IMP-09)</w:t>
+              <w:t xml:space="preserve">Pendiente: no aceptada en el Sprint 3 (criterio 2: no se registra la fecha de aceptación)</w:t>
             </w:r>
           </w:p>
         </w:tc>
@@ -4628,7 +4628,7 @@
               <w:rPr>
                 <w:sz w:val="19"/>
               </w:rPr>
-              <w:t xml:space="preserve">Puntos terminados (base + Sprints 1 y 2)</w:t>
+              <w:t xml:space="preserve">Puntos terminados (base + Sprints 1 a 3)</w:t>
             </w:r>
           </w:p>
         </w:tc>
@@ -4642,7 +4642,7 @@
               <w:rPr>
                 <w:sz w:val="19"/>
               </w:rPr>
-              <w:t xml:space="preserve">107</w:t>
+              <w:t xml:space="preserve">128</w:t>
             </w:r>
           </w:p>
         </w:tc>
@@ -4672,7 +4672,7 @@
               <w:rPr>
                 <w:sz w:val="19"/>
               </w:rPr>
-              <w:t xml:space="preserve">124 (incluye HU-05, 8 pts, hoy sin sprint asignado)</w:t>
+              <w:t xml:space="preserve">124 (incluye HU-05 y HU-12, 13 pts, hoy sin sprint asignado)</w:t>
             </w:r>
           </w:p>
         </w:tc>
@@ -5012,6 +5012,94 @@
                 <w:sz w:val="19"/>
               </w:rPr>
               <w:t xml:space="preserve">Sprint Planning 3: HU-18, 12 y 27 comprometidas (26 pts)</w:t>
+            </w:r>
+          </w:p>
+        </w:tc>
+      </w:tr>
+      <w:tr>
+        <w:tc>
+          <w:tcPr>
+            <w:tcW w:type="dxa" w:w="1134"/>
+          </w:tcPr>
+          <w:p>
+            <w:r/>
+            <w:r>
+              <w:rPr>
+                <w:sz w:val="19"/>
+              </w:rPr>
+              <w:t xml:space="preserve">1.5</w:t>
+            </w:r>
+          </w:p>
+        </w:tc>
+        <w:tc>
+          <w:tcPr>
+            <w:tcW w:type="dxa" w:w="1701"/>
+          </w:tcPr>
+          <w:p>
+            <w:r/>
+            <w:r>
+              <w:rPr>
+                <w:sz w:val="19"/>
+              </w:rPr>
+              <w:t xml:space="preserve">16-10-2026</w:t>
+            </w:r>
+          </w:p>
+        </w:tc>
+        <w:tc>
+          <w:tcPr>
+            <w:tcW w:type="dxa" w:w="6520"/>
+          </w:tcPr>
+          <w:p>
+            <w:r/>
+            <w:r>
+              <w:rPr>
+                <w:sz w:val="19"/>
+              </w:rPr>
+              <w:t xml:space="preserve">Cierre del Sprint 3: HU-18 y HU-27 pasan a Hecho; HU-12 no aceptada (criterio 2) y vuelve al backlog sin sprint</w:t>
+            </w:r>
+          </w:p>
+        </w:tc>
+      </w:tr>
+      <w:tr>
+        <w:tc>
+          <w:tcPr>
+            <w:tcW w:type="dxa" w:w="1134"/>
+          </w:tcPr>
+          <w:p>
+            <w:r/>
+            <w:r>
+              <w:rPr>
+                <w:sz w:val="19"/>
+              </w:rPr>
+              <w:t xml:space="preserve">1.6</w:t>
+            </w:r>
+          </w:p>
+        </w:tc>
+        <w:tc>
+          <w:tcPr>
+            <w:tcW w:type="dxa" w:w="1701"/>
+          </w:tcPr>
+          <w:p>
+            <w:r/>
+            <w:r>
+              <w:rPr>
+                <w:sz w:val="19"/>
+              </w:rPr>
+              <w:t xml:space="preserve">19-10-2026</w:t>
+            </w:r>
+          </w:p>
+        </w:tc>
+        <w:tc>
+          <w:tcPr>
+            <w:tcW w:type="dxa" w:w="6520"/>
+          </w:tcPr>
+          <w:p>
+            <w:r/>
+            <w:r>
+              <w:rPr>
+                <w:sz w:val="19"/>
+              </w:rPr>
+              <w:t xml:space="preserve">Sprint Planning 4: HU-21, 29, 32 y 24 comprometidas (23 pts)</w:t>
             </w:r>
           </w:p>
         </w:tc>

</xml_diff>